<commit_message>
Se añade la funcionalidad completa para el rol de Asesor (Supervisor).
- Se crea el Dashboard del Asesor con una lista de casos supervisados y métricas de carga de trabajo del equipo.
- Se implementa la Vista de Expediente detallada, permitiendo la supervisión completa de la línea de tiempo del caso.
- Se añade la capacidad para que el Asesor pueda crear sus propias 'Notas de Supervisión'.
- Se implementan las acciones de gestión del ciclo de vida del caso: 'Finalizar Caso' y 'Reasignar Caso'.
- Se integran las herramientas de IA (Asistente Jurídico y Generador de Documentos) en la vista del Asesor.
- Se implementa el flujo de trabajo completo para la revisión de documentos, permitiendo al Asesor 'Aprobar' o 'Solicitar Cambios' en los documentos enviados por los estudiantes.
- Se realizan correcciones de bugs visuales en los visores de reportes y en la vista de expediente para asegurar la correcta visualización del contenido.
</commit_message>
<xml_diff>
--- a/backend/datos/plantillas_documentos/accion_de_tutela.docx
+++ b/backend/datos/plantillas_documentos/accion_de_tutela.docx
@@ -39,149 +39,189 @@
         <w:t>Accionado: [NOMBRE DE LA ENTIDAD O PERSONA ACCIONADA]</w:t>
       </w:r>
     </w:p>
+    <w:p>
+      <w:pPr>
+        <w:jc w:val="both"/>
+      </w:pPr>
+    </w:p>
+    <w:p>
+      <w:pPr>
+        <w:jc w:val="both"/>
+      </w:pPr>
+      <w:r>
+        <w:t>Yo, {{NOMBRE_COMPLETO_USUARIO}}, identificado(a) con cédula de ciudadanía No. {{CEDULA_USUARIO}}, actuando en nombre propio, por medio del presente escrito interpongo ACCIÓN DE TUTELA en contra de [NOMBRE DE LA ENTIDAD ACCIONADA], con el fin de que se protejan mis derechos fundamentales que considero vulnerados, con base en los siguientes:</w:t>
+      </w:r>
+    </w:p>
     <w:p/>
     <w:p>
       <w:r>
-        <w:t>Yo, {{NOMBRE_COMPLETO_USUARIO}}, identificado(a) con cédula de ciudadanía No. {{CEDULA_USUARIO}}, actuando en nombre propio, por medio del presente escrito interpongo ACCIÓN DE TUTELA en contra de [NOMBRE DE LA ENTIDAD ACCIONADA], con el fin de que se protejan mis derechos fundamentales que considero vulnerados, con base en los siguientes:</w:t>
+        <w:t>HECHOS</w:t>
       </w:r>
     </w:p>
     <w:p/>
     <w:p>
-      <w:r>
-        <w:t>HECHOS</w:t>
+      <w:pPr>
+        <w:jc w:val="both"/>
+      </w:pPr>
+      <w:r>
+        <w:t xml:space="preserve">(A </w:t>
+      </w:r>
+      <w:proofErr w:type="gramStart"/>
+      <w:r>
+        <w:t>continuación</w:t>
+      </w:r>
+      <w:proofErr w:type="gramEnd"/>
+      <w:r>
+        <w:t xml:space="preserve"> se exponen los hechos que fundamentan la vulneración de derechos. El estudiante deberá adaptar y complementar esta sección).</w:t>
       </w:r>
     </w:p>
     <w:p/>
     <w:p>
-      <w:r>
-        <w:t xml:space="preserve">(A </w:t>
+      <w:pPr>
+        <w:jc w:val="both"/>
+      </w:pPr>
+      <w:r>
+        <w:t>{{HECHOS_DEL_CASO}}</w:t>
+      </w:r>
+    </w:p>
+    <w:p/>
+    <w:p>
+      <w:r>
+        <w:t>DERECHOS FUNDAMENTALES VULNERADOS</w:t>
+      </w:r>
+    </w:p>
+    <w:p/>
+    <w:p>
+      <w:pPr>
+        <w:jc w:val="both"/>
+      </w:pPr>
+      <w:r>
+        <w:t>Considero que con la acción/omisión de la entidad accionada se me están vulnerando los siguientes derechos fundamentales:</w:t>
+      </w:r>
+    </w:p>
+    <w:p>
+      <w:pPr>
+        <w:jc w:val="both"/>
+      </w:pPr>
+      <w:r>
+        <w:t>*</w:t>
       </w:r>
       <w:proofErr w:type="gramStart"/>
       <w:r>
-        <w:t>continuación</w:t>
+        <w:t xml:space="preserve">   [</w:t>
       </w:r>
       <w:proofErr w:type="gramEnd"/>
       <w:r>
-        <w:t xml:space="preserve"> se exponen los hechos que fundamentan la vulneración de derechos. El estudiante deberá adaptar y complementar esta sección).</w:t>
+        <w:t>Ejemplo: Derecho a la Salud (Art. 49 C.P.)]</w:t>
+      </w:r>
+    </w:p>
+    <w:p>
+      <w:pPr>
+        <w:jc w:val="both"/>
+      </w:pPr>
+      <w:r>
+        <w:t>*</w:t>
+      </w:r>
+      <w:proofErr w:type="gramStart"/>
+      <w:r>
+        <w:t xml:space="preserve">   [</w:t>
+      </w:r>
+      <w:proofErr w:type="gramEnd"/>
+      <w:r>
+        <w:t>Ejemplo: Derecho al Debido Proceso (Art. 29 C.P.)]</w:t>
+      </w:r>
+    </w:p>
+    <w:p>
+      <w:pPr>
+        <w:jc w:val="both"/>
+      </w:pPr>
+      <w:r>
+        <w:t>*</w:t>
+      </w:r>
+      <w:proofErr w:type="gramStart"/>
+      <w:r>
+        <w:t xml:space="preserve">   [</w:t>
+      </w:r>
+      <w:proofErr w:type="gramEnd"/>
+      <w:r>
+        <w:t>Ejemplo: Derecho de Petición (Art. 23 C.P.)]</w:t>
       </w:r>
     </w:p>
     <w:p/>
     <w:p>
       <w:r>
-        <w:t>{{HECHOS_DEL_CASO}}</w:t>
+        <w:t>PRETENSIONES</w:t>
       </w:r>
     </w:p>
     <w:p/>
     <w:p>
-      <w:r>
-        <w:t>DERECHOS FUNDAMENTALES VULNERADOS</w:t>
+      <w:pPr>
+        <w:jc w:val="both"/>
+      </w:pPr>
+      <w:r>
+        <w:t>Con fundamento en los hechos y consideraciones expuestas, solicito a usted, Señor(a) Juez, tutelar mis derechos fundamentales y, en consecuencia, ordenar a [NOMBRE DE LA ENTIDAD ACCIONADA] que en el término de cuarenta y ocho (48) horas:</w:t>
+      </w:r>
+    </w:p>
+    <w:p>
+      <w:pPr>
+        <w:jc w:val="both"/>
+      </w:pPr>
+      <w:proofErr w:type="gramStart"/>
+      <w:r>
+        <w:t>1.  [</w:t>
+      </w:r>
+      <w:proofErr w:type="gramEnd"/>
+      <w:r>
+        <w:t xml:space="preserve">ESCRIBIR AQUÍ LA ORDEN CONCRETA QUE SE PRETENDE. </w:t>
+      </w:r>
+      <w:proofErr w:type="spellStart"/>
+      <w:r>
+        <w:t>Ej</w:t>
+      </w:r>
+      <w:proofErr w:type="spellEnd"/>
+      <w:r>
+        <w:t>: "Proceda a autorizar y entregar el medicamento..."]</w:t>
+      </w:r>
+    </w:p>
+    <w:p>
+      <w:pPr>
+        <w:jc w:val="both"/>
+      </w:pPr>
+      <w:proofErr w:type="gramStart"/>
+      <w:r>
+        <w:t>2.  [</w:t>
+      </w:r>
+      <w:proofErr w:type="gramEnd"/>
+      <w:r>
+        <w:t>ESCRIBIR AQUÍ OTRA ORDEN SI ES NECESARIA]</w:t>
       </w:r>
     </w:p>
     <w:p/>
     <w:p>
       <w:r>
-        <w:t>Considero que con la acción/omisión de la entidad accionada se me están vulnerando los siguientes derechos fundamentales:</w:t>
-      </w:r>
-    </w:p>
-    <w:p>
-      <w:r>
-        <w:t>*</w:t>
-      </w:r>
-      <w:proofErr w:type="gramStart"/>
-      <w:r>
-        <w:t xml:space="preserve">   [</w:t>
-      </w:r>
-      <w:proofErr w:type="gramEnd"/>
-      <w:r>
-        <w:t>Ejemplo: Derecho a la Salud (Art. 49 C.P.)]</w:t>
-      </w:r>
-    </w:p>
-    <w:p>
-      <w:r>
-        <w:t>*</w:t>
-      </w:r>
-      <w:proofErr w:type="gramStart"/>
-      <w:r>
-        <w:t xml:space="preserve">   [</w:t>
-      </w:r>
-      <w:proofErr w:type="gramEnd"/>
-      <w:r>
-        <w:t>Ejemplo: Derecho al Debido Proceso (Art. 29 C.P.)]</w:t>
-      </w:r>
-    </w:p>
-    <w:p>
-      <w:r>
-        <w:t>*</w:t>
-      </w:r>
-      <w:proofErr w:type="gramStart"/>
-      <w:r>
-        <w:t xml:space="preserve">   [</w:t>
-      </w:r>
-      <w:proofErr w:type="gramEnd"/>
-      <w:r>
-        <w:t>Ejemplo: Derecho de Petición (Art. 23 C.P.)]</w:t>
+        <w:t>JURAMENTO</w:t>
       </w:r>
     </w:p>
     <w:p/>
     <w:p>
-      <w:r>
-        <w:t>PRETENSIONES</w:t>
+      <w:pPr>
+        <w:jc w:val="both"/>
+      </w:pPr>
+      <w:r>
+        <w:t>Bajo la gravedad del juramento manifiesto que no he presentado otra acción de tutela por los mismos hechos y derechos.</w:t>
       </w:r>
     </w:p>
     <w:p/>
     <w:p>
       <w:r>
-        <w:t>Con fundamento en los hechos y consideraciones expuestas, solicito a usted, Señor(a) Juez, tutelar mis derechos fundamentales y, en consecuencia, ordenar a [NOMBRE DE LA ENTIDAD ACCIONADA] que en el término de cuarenta y ocho (48) horas:</w:t>
-      </w:r>
-    </w:p>
-    <w:p>
-      <w:proofErr w:type="gramStart"/>
-      <w:r>
-        <w:t>1.  [</w:t>
-      </w:r>
-      <w:proofErr w:type="gramEnd"/>
-      <w:r>
-        <w:t xml:space="preserve">ESCRIBIR AQUÍ LA ORDEN CONCRETA QUE SE PRETENDE. </w:t>
-      </w:r>
-      <w:proofErr w:type="spellStart"/>
-      <w:r>
-        <w:t>Ej</w:t>
-      </w:r>
-      <w:proofErr w:type="spellEnd"/>
-      <w:r>
-        <w:t>: "Proceda a autorizar y entregar el medicamento..."]</w:t>
-      </w:r>
-    </w:p>
-    <w:p>
-      <w:proofErr w:type="gramStart"/>
-      <w:r>
-        <w:t>2.  [</w:t>
-      </w:r>
-      <w:proofErr w:type="gramEnd"/>
-      <w:r>
-        <w:t>ESCRIBIR AQUÍ OTRA ORDEN SI ES NECESARIA]</w:t>
+        <w:t>NOTIFICACIONES</w:t>
       </w:r>
     </w:p>
     <w:p/>
     <w:p>
-      <w:r>
-        <w:t>JURAMENTO</w:t>
-      </w:r>
-    </w:p>
-    <w:p/>
-    <w:p>
-      <w:r>
-        <w:t>Bajo la gravedad del juramento manifiesto que no he presentado otra acción de tutela por los mismos hechos y derechos.</w:t>
-      </w:r>
-    </w:p>
-    <w:p/>
-    <w:p>
-      <w:r>
-        <w:t>NOTIFICACIONES</w:t>
-      </w:r>
-    </w:p>
-    <w:p/>
-    <w:p>
+      <w:pPr>
+        <w:jc w:val="both"/>
+      </w:pPr>
       <w:r>
         <w:t>Recibiré notificaciones en la siguiente dirección: [Dirección del accionante] y en el correo electrónico: [Correo electrónico del accionante].</w:t>
       </w:r>

</xml_diff>